<commit_message>
Security: clear data, library checks, alerts, patched libraries
</commit_message>
<xml_diff>
--- a/PRD_Design_ProjCharter_Eval_Investment Research Library.docx
+++ b/PRD_Design_ProjCharter_Eval_Investment Research Library.docx
@@ -8187,6 +8187,1229 @@
       </w:r>
       <w:r>
         <w:t xml:space="preserve"> your own words on RAG, guardrails, testing AI systems and pricing a product.</w:t>
+      </w:r>
+    </w:p>
+    <w:p>
+      <w:r>
+        <w:br w:type="page"/>
+      </w:r>
+    </w:p>
+    <w:p>
+      <w:r>
+        <w:lastRenderedPageBreak/>
+        <w:t>Website Security Design</w:t>
+      </w:r>
+    </w:p>
+    <w:p>
+      <w:r>
+        <w:t xml:space="preserve">Let me check exactly what's in your code before answering, particularly the payment routes and security </w:t>
+      </w:r>
+      <w:proofErr w:type="spellStart"/>
+      <w:r>
+        <w:t>headers.Your</w:t>
+      </w:r>
+      <w:proofErr w:type="spellEnd"/>
+      <w:r>
+        <w:t xml:space="preserve"> app already has solid protection in place, and I've checked each item below in your code. There are also a few gaps worth closing, mostly in your </w:t>
+      </w:r>
+      <w:r>
+        <w:rPr>
+          <w:i/>
+          <w:iCs/>
+        </w:rPr>
+        <w:t>accounts</w:t>
+      </w:r>
+      <w:r>
+        <w:t xml:space="preserve"> rather than the code.</w:t>
+      </w:r>
+    </w:p>
+    <w:p>
+      <w:pPr>
+        <w:rPr>
+          <w:b/>
+          <w:bCs/>
+        </w:rPr>
+      </w:pPr>
+      <w:r>
+        <w:rPr>
+          <w:b/>
+          <w:bCs/>
+        </w:rPr>
+        <w:t>Payments</w:t>
+      </w:r>
+    </w:p>
+    <w:tbl>
+      <w:tblPr>
+        <w:tblW w:w="0" w:type="auto"/>
+        <w:tblCellSpacing w:w="15" w:type="dxa"/>
+        <w:tblCellMar>
+          <w:top w:w="15" w:type="dxa"/>
+          <w:left w:w="15" w:type="dxa"/>
+          <w:bottom w:w="15" w:type="dxa"/>
+          <w:right w:w="15" w:type="dxa"/>
+        </w:tblCellMar>
+        <w:tblLook w:val="04A0" w:firstRow="1" w:lastRow="0" w:firstColumn="1" w:lastColumn="0" w:noHBand="0" w:noVBand="1"/>
+      </w:tblPr>
+      <w:tblGrid>
+        <w:gridCol w:w="1829"/>
+        <w:gridCol w:w="7197"/>
+      </w:tblGrid>
+      <w:tr>
+        <w:trPr>
+          <w:tblHeader/>
+          <w:tblCellSpacing w:w="15" w:type="dxa"/>
+        </w:trPr>
+        <w:tc>
+          <w:tcPr>
+            <w:tcW w:w="0" w:type="auto"/>
+            <w:vAlign w:val="center"/>
+            <w:hideMark/>
+          </w:tcPr>
+          <w:p>
+            <w:pPr>
+              <w:rPr>
+                <w:b/>
+                <w:bCs/>
+              </w:rPr>
+            </w:pPr>
+            <w:r>
+              <w:rPr>
+                <w:b/>
+                <w:bCs/>
+              </w:rPr>
+              <w:t>Protection</w:t>
+            </w:r>
+          </w:p>
+        </w:tc>
+        <w:tc>
+          <w:tcPr>
+            <w:tcW w:w="0" w:type="auto"/>
+            <w:vAlign w:val="center"/>
+            <w:hideMark/>
+          </w:tcPr>
+          <w:p>
+            <w:pPr>
+              <w:rPr>
+                <w:b/>
+                <w:bCs/>
+              </w:rPr>
+            </w:pPr>
+            <w:r>
+              <w:rPr>
+                <w:b/>
+                <w:bCs/>
+              </w:rPr>
+              <w:t>What it means</w:t>
+            </w:r>
+          </w:p>
+        </w:tc>
+      </w:tr>
+      <w:tr>
+        <w:trPr>
+          <w:tblCellSpacing w:w="15" w:type="dxa"/>
+        </w:trPr>
+        <w:tc>
+          <w:tcPr>
+            <w:tcW w:w="0" w:type="auto"/>
+            <w:vAlign w:val="center"/>
+            <w:hideMark/>
+          </w:tcPr>
+          <w:p>
+            <w:r>
+              <w:rPr>
+                <w:b/>
+                <w:bCs/>
+              </w:rPr>
+              <w:t>Stripe hosted checkout</w:t>
+            </w:r>
+          </w:p>
+        </w:tc>
+        <w:tc>
+          <w:tcPr>
+            <w:tcW w:w="0" w:type="auto"/>
+            <w:vAlign w:val="center"/>
+            <w:hideMark/>
+          </w:tcPr>
+          <w:p>
+            <w:r>
+              <w:t>Card details are typed on Stripe's page, never on your site. Your server never sees or stores a card number, which is the safest setup for payments and keeps most card-security (PCI) obligations with Stripe.</w:t>
+            </w:r>
+          </w:p>
+        </w:tc>
+      </w:tr>
+      <w:tr>
+        <w:trPr>
+          <w:tblCellSpacing w:w="15" w:type="dxa"/>
+        </w:trPr>
+        <w:tc>
+          <w:tcPr>
+            <w:tcW w:w="0" w:type="auto"/>
+            <w:vAlign w:val="center"/>
+            <w:hideMark/>
+          </w:tcPr>
+          <w:p>
+            <w:r>
+              <w:rPr>
+                <w:b/>
+                <w:bCs/>
+              </w:rPr>
+              <w:t>Prices set on the server</w:t>
+            </w:r>
+          </w:p>
+        </w:tc>
+        <w:tc>
+          <w:tcPr>
+            <w:tcW w:w="0" w:type="auto"/>
+            <w:vAlign w:val="center"/>
+            <w:hideMark/>
+          </w:tcPr>
+          <w:p>
+            <w:r>
+              <w:t xml:space="preserve">The browser can only say "basic", "premium" or "pro". The actual price IDs come from your </w:t>
+            </w:r>
+            <w:proofErr w:type="spellStart"/>
+            <w:r>
+              <w:t>Vercel</w:t>
+            </w:r>
+            <w:proofErr w:type="spellEnd"/>
+            <w:r>
+              <w:t xml:space="preserve"> settings, so nobody can change the price they pay.</w:t>
+            </w:r>
+          </w:p>
+        </w:tc>
+      </w:tr>
+      <w:tr>
+        <w:trPr>
+          <w:tblCellSpacing w:w="15" w:type="dxa"/>
+        </w:trPr>
+        <w:tc>
+          <w:tcPr>
+            <w:tcW w:w="0" w:type="auto"/>
+            <w:vAlign w:val="center"/>
+            <w:hideMark/>
+          </w:tcPr>
+          <w:p>
+            <w:r>
+              <w:rPr>
+                <w:b/>
+                <w:bCs/>
+              </w:rPr>
+              <w:t>Sign-in required to pay</w:t>
+            </w:r>
+          </w:p>
+        </w:tc>
+        <w:tc>
+          <w:tcPr>
+            <w:tcW w:w="0" w:type="auto"/>
+            <w:vAlign w:val="center"/>
+            <w:hideMark/>
+          </w:tcPr>
+          <w:p>
+            <w:r>
+              <w:t>Checkout and the billing portal refuse anyone not signed in.</w:t>
+            </w:r>
+          </w:p>
+        </w:tc>
+      </w:tr>
+      <w:tr>
+        <w:trPr>
+          <w:tblCellSpacing w:w="15" w:type="dxa"/>
+        </w:trPr>
+        <w:tc>
+          <w:tcPr>
+            <w:tcW w:w="0" w:type="auto"/>
+            <w:vAlign w:val="center"/>
+            <w:hideMark/>
+          </w:tcPr>
+          <w:p>
+            <w:r>
+              <w:rPr>
+                <w:b/>
+                <w:bCs/>
+              </w:rPr>
+              <w:t>Webhook signature check</w:t>
+            </w:r>
+          </w:p>
+        </w:tc>
+        <w:tc>
+          <w:tcPr>
+            <w:tcW w:w="0" w:type="auto"/>
+            <w:vAlign w:val="center"/>
+            <w:hideMark/>
+          </w:tcPr>
+          <w:p>
+            <w:r>
+              <w:t>Plan upgrades only happen when Stripe's signed message checks out against STRIPE_WEBHOOK_SECRET, so nobody can fake a "paid" message to get a free plan.</w:t>
+            </w:r>
+          </w:p>
+        </w:tc>
+      </w:tr>
+      <w:tr>
+        <w:trPr>
+          <w:tblCellSpacing w:w="15" w:type="dxa"/>
+        </w:trPr>
+        <w:tc>
+          <w:tcPr>
+            <w:tcW w:w="0" w:type="auto"/>
+            <w:vAlign w:val="center"/>
+            <w:hideMark/>
+          </w:tcPr>
+          <w:p>
+            <w:r>
+              <w:rPr>
+                <w:b/>
+                <w:bCs/>
+              </w:rPr>
+              <w:t>Plans can't be self-edited</w:t>
+            </w:r>
+          </w:p>
+        </w:tc>
+        <w:tc>
+          <w:tcPr>
+            <w:tcW w:w="0" w:type="auto"/>
+            <w:vAlign w:val="center"/>
+            <w:hideMark/>
+          </w:tcPr>
+          <w:p>
+            <w:r>
+              <w:t>The plan is stored in Clerk's public metadata, which only your server can change, not the user's browser.</w:t>
+            </w:r>
+          </w:p>
+        </w:tc>
+      </w:tr>
+      <w:tr>
+        <w:trPr>
+          <w:tblCellSpacing w:w="15" w:type="dxa"/>
+        </w:trPr>
+        <w:tc>
+          <w:tcPr>
+            <w:tcW w:w="0" w:type="auto"/>
+            <w:vAlign w:val="center"/>
+            <w:hideMark/>
+          </w:tcPr>
+          <w:p>
+            <w:r>
+              <w:rPr>
+                <w:b/>
+                <w:bCs/>
+              </w:rPr>
+              <w:t>Billing portal is locked to the account</w:t>
+            </w:r>
+          </w:p>
+        </w:tc>
+        <w:tc>
+          <w:tcPr>
+            <w:tcW w:w="0" w:type="auto"/>
+            <w:vAlign w:val="center"/>
+            <w:hideMark/>
+          </w:tcPr>
+          <w:p>
+            <w:r>
+              <w:t>The Stripe customer ID comes from the signed-in account's private metadata, never from the browser, so nobody can open someone else's billing page.</w:t>
+            </w:r>
+          </w:p>
+        </w:tc>
+      </w:tr>
+      <w:tr>
+        <w:trPr>
+          <w:tblCellSpacing w:w="15" w:type="dxa"/>
+        </w:trPr>
+        <w:tc>
+          <w:tcPr>
+            <w:tcW w:w="0" w:type="auto"/>
+            <w:vAlign w:val="center"/>
+            <w:hideMark/>
+          </w:tcPr>
+          <w:p>
+            <w:r>
+              <w:rPr>
+                <w:b/>
+                <w:bCs/>
+              </w:rPr>
+              <w:t>Checkout rate limit</w:t>
+            </w:r>
+          </w:p>
+        </w:tc>
+        <w:tc>
+          <w:tcPr>
+            <w:tcW w:w="0" w:type="auto"/>
+            <w:vAlign w:val="center"/>
+            <w:hideMark/>
+          </w:tcPr>
+          <w:p>
+            <w:r>
+              <w:t>Stops scripted card testing and checkout spam.</w:t>
+            </w:r>
+          </w:p>
+        </w:tc>
+      </w:tr>
+    </w:tbl>
+    <w:p>
+      <w:pPr>
+        <w:rPr>
+          <w:b/>
+          <w:bCs/>
+        </w:rPr>
+      </w:pPr>
+      <w:r>
+        <w:rPr>
+          <w:b/>
+          <w:bCs/>
+        </w:rPr>
+        <w:t>Users' financial details</w:t>
+      </w:r>
+    </w:p>
+    <w:tbl>
+      <w:tblPr>
+        <w:tblW w:w="0" w:type="auto"/>
+        <w:tblCellSpacing w:w="15" w:type="dxa"/>
+        <w:tblCellMar>
+          <w:top w:w="15" w:type="dxa"/>
+          <w:left w:w="15" w:type="dxa"/>
+          <w:bottom w:w="15" w:type="dxa"/>
+          <w:right w:w="15" w:type="dxa"/>
+        </w:tblCellMar>
+        <w:tblLook w:val="04A0" w:firstRow="1" w:lastRow="0" w:firstColumn="1" w:lastColumn="0" w:noHBand="0" w:noVBand="1"/>
+      </w:tblPr>
+      <w:tblGrid>
+        <w:gridCol w:w="2037"/>
+        <w:gridCol w:w="6989"/>
+      </w:tblGrid>
+      <w:tr>
+        <w:trPr>
+          <w:tblHeader/>
+          <w:tblCellSpacing w:w="15" w:type="dxa"/>
+        </w:trPr>
+        <w:tc>
+          <w:tcPr>
+            <w:tcW w:w="0" w:type="auto"/>
+            <w:vAlign w:val="center"/>
+            <w:hideMark/>
+          </w:tcPr>
+          <w:p>
+            <w:pPr>
+              <w:rPr>
+                <w:b/>
+                <w:bCs/>
+              </w:rPr>
+            </w:pPr>
+            <w:r>
+              <w:rPr>
+                <w:b/>
+                <w:bCs/>
+              </w:rPr>
+              <w:t>Protection</w:t>
+            </w:r>
+          </w:p>
+        </w:tc>
+        <w:tc>
+          <w:tcPr>
+            <w:tcW w:w="0" w:type="auto"/>
+            <w:vAlign w:val="center"/>
+            <w:hideMark/>
+          </w:tcPr>
+          <w:p>
+            <w:pPr>
+              <w:rPr>
+                <w:b/>
+                <w:bCs/>
+              </w:rPr>
+            </w:pPr>
+            <w:r>
+              <w:rPr>
+                <w:b/>
+                <w:bCs/>
+              </w:rPr>
+              <w:t>What it means</w:t>
+            </w:r>
+          </w:p>
+        </w:tc>
+      </w:tr>
+      <w:tr>
+        <w:trPr>
+          <w:tblCellSpacing w:w="15" w:type="dxa"/>
+        </w:trPr>
+        <w:tc>
+          <w:tcPr>
+            <w:tcW w:w="0" w:type="auto"/>
+            <w:vAlign w:val="center"/>
+            <w:hideMark/>
+          </w:tcPr>
+          <w:p>
+            <w:r>
+              <w:rPr>
+                <w:b/>
+                <w:bCs/>
+              </w:rPr>
+              <w:t>Projector runs in the browser</w:t>
+            </w:r>
+          </w:p>
+        </w:tc>
+        <w:tc>
+          <w:tcPr>
+            <w:tcW w:w="0" w:type="auto"/>
+            <w:vAlign w:val="center"/>
+            <w:hideMark/>
+          </w:tcPr>
+          <w:p>
+            <w:r>
+              <w:t xml:space="preserve">Ages, balances, property, income and pensions entered in the projector are </w:t>
+            </w:r>
+            <w:r>
+              <w:rPr>
+                <w:b/>
+                <w:bCs/>
+              </w:rPr>
+              <w:t>never sent to your server</w:t>
+            </w:r>
+            <w:r>
+              <w:t>. Saved plans stay in that browser only.</w:t>
+            </w:r>
+          </w:p>
+        </w:tc>
+      </w:tr>
+      <w:tr>
+        <w:trPr>
+          <w:tblCellSpacing w:w="15" w:type="dxa"/>
+        </w:trPr>
+        <w:tc>
+          <w:tcPr>
+            <w:tcW w:w="0" w:type="auto"/>
+            <w:vAlign w:val="center"/>
+            <w:hideMark/>
+          </w:tcPr>
+          <w:p>
+            <w:r>
+              <w:rPr>
+                <w:b/>
+                <w:bCs/>
+              </w:rPr>
+              <w:t>Follow-up context is checked</w:t>
+            </w:r>
+          </w:p>
+        </w:tc>
+        <w:tc>
+          <w:tcPr>
+            <w:tcW w:w="0" w:type="auto"/>
+            <w:vAlign w:val="center"/>
+            <w:hideMark/>
+          </w:tcPr>
+          <w:p>
+            <w:r>
+              <w:t>When earlier plan numbers are sent back with a follow-up question, they're re-checked and anything unknown is dropped.</w:t>
+            </w:r>
+          </w:p>
+        </w:tc>
+      </w:tr>
+      <w:tr>
+        <w:trPr>
+          <w:tblCellSpacing w:w="15" w:type="dxa"/>
+        </w:trPr>
+        <w:tc>
+          <w:tcPr>
+            <w:tcW w:w="0" w:type="auto"/>
+            <w:vAlign w:val="center"/>
+            <w:hideMark/>
+          </w:tcPr>
+          <w:p>
+            <w:r>
+              <w:rPr>
+                <w:b/>
+                <w:bCs/>
+              </w:rPr>
+              <w:t>Chat questions are cleaned before leaving your server</w:t>
+            </w:r>
+          </w:p>
+        </w:tc>
+        <w:tc>
+          <w:tcPr>
+            <w:tcW w:w="0" w:type="auto"/>
+            <w:vAlign w:val="center"/>
+            <w:hideMark/>
+          </w:tcPr>
+          <w:p>
+            <w:r>
+              <w:t xml:space="preserve">Before a question goes to OpenAI, the app removes bank account numbers, IRD numbers, emails, phone numbers, dates of birth, street addresses, passport and licence numbers, and anything that looks like a secret key. </w:t>
+            </w:r>
+            <w:r>
+              <w:rPr>
+                <w:b/>
+                <w:bCs/>
+              </w:rPr>
+              <w:t>Card numbers, security codes and expiry dates block the question entirely.</w:t>
+            </w:r>
+            <w:r>
+              <w:t xml:space="preserve"> Ages and dollar amounts are kept, because the answers need them.</w:t>
+            </w:r>
+          </w:p>
+        </w:tc>
+      </w:tr>
+      <w:tr>
+        <w:trPr>
+          <w:tblCellSpacing w:w="15" w:type="dxa"/>
+        </w:trPr>
+        <w:tc>
+          <w:tcPr>
+            <w:tcW w:w="0" w:type="auto"/>
+            <w:vAlign w:val="center"/>
+            <w:hideMark/>
+          </w:tcPr>
+          <w:p>
+            <w:r>
+              <w:rPr>
+                <w:b/>
+                <w:bCs/>
+              </w:rPr>
+              <w:lastRenderedPageBreak/>
+              <w:t>Questions aren't stored</w:t>
+            </w:r>
+          </w:p>
+        </w:tc>
+        <w:tc>
+          <w:tcPr>
+            <w:tcW w:w="0" w:type="auto"/>
+            <w:vAlign w:val="center"/>
+            <w:hideMark/>
+          </w:tcPr>
+          <w:p>
+            <w:r>
+              <w:t>Your app doesn't save chat questions. Logs are passed through the same redaction.</w:t>
+            </w:r>
+          </w:p>
+        </w:tc>
+      </w:tr>
+      <w:tr>
+        <w:trPr>
+          <w:tblCellSpacing w:w="15" w:type="dxa"/>
+        </w:trPr>
+        <w:tc>
+          <w:tcPr>
+            <w:tcW w:w="0" w:type="auto"/>
+            <w:vAlign w:val="center"/>
+            <w:hideMark/>
+          </w:tcPr>
+          <w:p>
+            <w:r>
+              <w:rPr>
+                <w:b/>
+                <w:bCs/>
+              </w:rPr>
+              <w:t>Visitors are anonymised</w:t>
+            </w:r>
+          </w:p>
+        </w:tc>
+        <w:tc>
+          <w:tcPr>
+            <w:tcW w:w="0" w:type="auto"/>
+            <w:vAlign w:val="center"/>
+            <w:hideMark/>
+          </w:tcPr>
+          <w:p>
+            <w:r>
+              <w:t>Question counts use a salted hash of the IP address (IP_HASH_SALT), not the address itself.</w:t>
+            </w:r>
+          </w:p>
+        </w:tc>
+      </w:tr>
+    </w:tbl>
+    <w:p>
+      <w:pPr>
+        <w:rPr>
+          <w:b/>
+          <w:bCs/>
+        </w:rPr>
+      </w:pPr>
+      <w:r>
+        <w:rPr>
+          <w:b/>
+          <w:bCs/>
+        </w:rPr>
+        <w:t>Protection against attacks</w:t>
+      </w:r>
+    </w:p>
+    <w:tbl>
+      <w:tblPr>
+        <w:tblW w:w="0" w:type="auto"/>
+        <w:tblCellSpacing w:w="15" w:type="dxa"/>
+        <w:tblCellMar>
+          <w:top w:w="15" w:type="dxa"/>
+          <w:left w:w="15" w:type="dxa"/>
+          <w:bottom w:w="15" w:type="dxa"/>
+          <w:right w:w="15" w:type="dxa"/>
+        </w:tblCellMar>
+        <w:tblLook w:val="04A0" w:firstRow="1" w:lastRow="0" w:firstColumn="1" w:lastColumn="0" w:noHBand="0" w:noVBand="1"/>
+      </w:tblPr>
+      <w:tblGrid>
+        <w:gridCol w:w="3924"/>
+        <w:gridCol w:w="5102"/>
+      </w:tblGrid>
+      <w:tr>
+        <w:trPr>
+          <w:tblHeader/>
+          <w:tblCellSpacing w:w="15" w:type="dxa"/>
+        </w:trPr>
+        <w:tc>
+          <w:tcPr>
+            <w:tcW w:w="0" w:type="auto"/>
+            <w:vAlign w:val="center"/>
+            <w:hideMark/>
+          </w:tcPr>
+          <w:p>
+            <w:pPr>
+              <w:rPr>
+                <w:b/>
+                <w:bCs/>
+              </w:rPr>
+            </w:pPr>
+            <w:r>
+              <w:rPr>
+                <w:b/>
+                <w:bCs/>
+              </w:rPr>
+              <w:t>Protection</w:t>
+            </w:r>
+          </w:p>
+        </w:tc>
+        <w:tc>
+          <w:tcPr>
+            <w:tcW w:w="0" w:type="auto"/>
+            <w:vAlign w:val="center"/>
+            <w:hideMark/>
+          </w:tcPr>
+          <w:p>
+            <w:pPr>
+              <w:rPr>
+                <w:b/>
+                <w:bCs/>
+              </w:rPr>
+            </w:pPr>
+            <w:r>
+              <w:rPr>
+                <w:b/>
+                <w:bCs/>
+              </w:rPr>
+              <w:t>What it blocks</w:t>
+            </w:r>
+          </w:p>
+        </w:tc>
+      </w:tr>
+      <w:tr>
+        <w:trPr>
+          <w:tblCellSpacing w:w="15" w:type="dxa"/>
+        </w:trPr>
+        <w:tc>
+          <w:tcPr>
+            <w:tcW w:w="0" w:type="auto"/>
+            <w:vAlign w:val="center"/>
+            <w:hideMark/>
+          </w:tcPr>
+          <w:p>
+            <w:r>
+              <w:rPr>
+                <w:b/>
+                <w:bCs/>
+              </w:rPr>
+              <w:t>Security headers</w:t>
+            </w:r>
+            <w:r>
+              <w:t xml:space="preserve"> (Content Security Policy, HSTS, X-Frame-Options: DENY and others)</w:t>
+            </w:r>
+          </w:p>
+        </w:tc>
+        <w:tc>
+          <w:tcPr>
+            <w:tcW w:w="0" w:type="auto"/>
+            <w:vAlign w:val="center"/>
+            <w:hideMark/>
+          </w:tcPr>
+          <w:p>
+            <w:r>
+              <w:t>Injected scripts, your site being framed by a fake site (clickjacking), forms posting elsewhere, and insecure connections</w:t>
+            </w:r>
+          </w:p>
+        </w:tc>
+      </w:tr>
+      <w:tr>
+        <w:trPr>
+          <w:tblCellSpacing w:w="15" w:type="dxa"/>
+        </w:trPr>
+        <w:tc>
+          <w:tcPr>
+            <w:tcW w:w="0" w:type="auto"/>
+            <w:vAlign w:val="center"/>
+            <w:hideMark/>
+          </w:tcPr>
+          <w:p>
+            <w:r>
+              <w:rPr>
+                <w:b/>
+                <w:bCs/>
+              </w:rPr>
+              <w:t>Same-origin checks</w:t>
+            </w:r>
+          </w:p>
+        </w:tc>
+        <w:tc>
+          <w:tcPr>
+            <w:tcW w:w="0" w:type="auto"/>
+            <w:vAlign w:val="center"/>
+            <w:hideMark/>
+          </w:tcPr>
+          <w:p>
+            <w:r>
+              <w:t>Other websites making requests to your app on a user's behalf</w:t>
+            </w:r>
+          </w:p>
+        </w:tc>
+      </w:tr>
+      <w:tr>
+        <w:trPr>
+          <w:tblCellSpacing w:w="15" w:type="dxa"/>
+        </w:trPr>
+        <w:tc>
+          <w:tcPr>
+            <w:tcW w:w="0" w:type="auto"/>
+            <w:vAlign w:val="center"/>
+            <w:hideMark/>
+          </w:tcPr>
+          <w:p>
+            <w:r>
+              <w:rPr>
+                <w:b/>
+                <w:bCs/>
+              </w:rPr>
+              <w:t>Size and length limits</w:t>
+            </w:r>
+          </w:p>
+        </w:tc>
+        <w:tc>
+          <w:tcPr>
+            <w:tcW w:w="0" w:type="auto"/>
+            <w:vAlign w:val="center"/>
+            <w:hideMark/>
+          </w:tcPr>
+          <w:p>
+            <w:r>
+              <w:t>Oversized or flooding requests</w:t>
+            </w:r>
+          </w:p>
+        </w:tc>
+      </w:tr>
+      <w:tr>
+        <w:trPr>
+          <w:tblCellSpacing w:w="15" w:type="dxa"/>
+        </w:trPr>
+        <w:tc>
+          <w:tcPr>
+            <w:tcW w:w="0" w:type="auto"/>
+            <w:vAlign w:val="center"/>
+            <w:hideMark/>
+          </w:tcPr>
+          <w:p>
+            <w:r>
+              <w:rPr>
+                <w:b/>
+                <w:bCs/>
+              </w:rPr>
+              <w:t>Rate limits</w:t>
+            </w:r>
+            <w:r>
+              <w:t xml:space="preserve"> (8 a minute, plus monthly allowances)</w:t>
+            </w:r>
+          </w:p>
+        </w:tc>
+        <w:tc>
+          <w:tcPr>
+            <w:tcW w:w="0" w:type="auto"/>
+            <w:vAlign w:val="center"/>
+            <w:hideMark/>
+          </w:tcPr>
+          <w:p>
+            <w:r>
+              <w:t>Scripted abuse and runaway AI bills. If limits can't be checked, the app refuses rather than running unprotected.</w:t>
+            </w:r>
+          </w:p>
+        </w:tc>
+      </w:tr>
+      <w:tr>
+        <w:trPr>
+          <w:tblCellSpacing w:w="15" w:type="dxa"/>
+        </w:trPr>
+        <w:tc>
+          <w:tcPr>
+            <w:tcW w:w="0" w:type="auto"/>
+            <w:vAlign w:val="center"/>
+            <w:hideMark/>
+          </w:tcPr>
+          <w:p>
+            <w:r>
+              <w:rPr>
+                <w:b/>
+                <w:bCs/>
+              </w:rPr>
+              <w:t>Input validation</w:t>
+            </w:r>
+            <w:r>
+              <w:t xml:space="preserve"> on every tool</w:t>
+            </w:r>
+          </w:p>
+        </w:tc>
+        <w:tc>
+          <w:tcPr>
+            <w:tcW w:w="0" w:type="auto"/>
+            <w:vAlign w:val="center"/>
+            <w:hideMark/>
+          </w:tcPr>
+          <w:p>
+            <w:r>
+              <w:t>Bad or malicious inputs become an error message, not a crash</w:t>
+            </w:r>
+          </w:p>
+        </w:tc>
+      </w:tr>
+      <w:tr>
+        <w:trPr>
+          <w:tblCellSpacing w:w="15" w:type="dxa"/>
+        </w:trPr>
+        <w:tc>
+          <w:tcPr>
+            <w:tcW w:w="0" w:type="auto"/>
+            <w:vAlign w:val="center"/>
+            <w:hideMark/>
+          </w:tcPr>
+          <w:p>
+            <w:r>
+              <w:rPr>
+                <w:b/>
+                <w:bCs/>
+              </w:rPr>
+              <w:t>Safe rendering</w:t>
+            </w:r>
+          </w:p>
+        </w:tc>
+        <w:tc>
+          <w:tcPr>
+            <w:tcW w:w="0" w:type="auto"/>
+            <w:vAlign w:val="center"/>
+            <w:hideMark/>
+          </w:tcPr>
+          <w:p>
+            <w:r>
+              <w:t>React escapes text, and only http(s) links are shown in answers, which blocks script links</w:t>
+            </w:r>
+          </w:p>
+        </w:tc>
+      </w:tr>
+      <w:tr>
+        <w:trPr>
+          <w:tblCellSpacing w:w="15" w:type="dxa"/>
+        </w:trPr>
+        <w:tc>
+          <w:tcPr>
+            <w:tcW w:w="0" w:type="auto"/>
+            <w:vAlign w:val="center"/>
+            <w:hideMark/>
+          </w:tcPr>
+          <w:p>
+            <w:r>
+              <w:rPr>
+                <w:b/>
+                <w:bCs/>
+              </w:rPr>
+              <w:t>Secrets only in environment variables</w:t>
+            </w:r>
+          </w:p>
+        </w:tc>
+        <w:tc>
+          <w:tcPr>
+            <w:tcW w:w="0" w:type="auto"/>
+            <w:vAlign w:val="center"/>
+            <w:hideMark/>
+          </w:tcPr>
+          <w:p>
+            <w:r>
+              <w:t>No keys in your code or on GitHub</w:t>
+            </w:r>
+          </w:p>
+        </w:tc>
+      </w:tr>
+    </w:tbl>
+    <w:p>
+      <w:pPr>
+        <w:pBdr>
+          <w:bottom w:val="single" w:sz="4" w:space="1" w:color="auto"/>
+        </w:pBdr>
+        <w:rPr>
+          <w:b/>
+          <w:bCs/>
+        </w:rPr>
+      </w:pPr>
+      <w:r>
+        <w:rPr>
+          <w:b/>
+          <w:bCs/>
+          <w:highlight w:val="darkGray"/>
+        </w:rPr>
+        <w:t xml:space="preserve">Things to do to improve security of my Investment Research app - </w:t>
+      </w:r>
+      <w:r>
+        <w:rPr>
+          <w:b/>
+          <w:bCs/>
+          <w:highlight w:val="darkGray"/>
+        </w:rPr>
+        <w:t>G</w:t>
+      </w:r>
+      <w:r>
+        <w:rPr>
+          <w:b/>
+          <w:bCs/>
+          <w:highlight w:val="darkGray"/>
+        </w:rPr>
+        <w:t>aps to close</w:t>
+      </w:r>
+    </w:p>
+    <w:p>
+      <w:pPr>
+        <w:numPr>
+          <w:ilvl w:val="0"/>
+          <w:numId w:val="9"/>
+        </w:numPr>
+      </w:pPr>
+      <w:r>
+        <w:rPr>
+          <w:b/>
+          <w:bCs/>
+        </w:rPr>
+        <w:t>Turn on two-factor authentication</w:t>
+      </w:r>
+      <w:r>
+        <w:t xml:space="preserve"> for </w:t>
+      </w:r>
+      <w:r>
+        <w:rPr>
+          <w:b/>
+          <w:bCs/>
+        </w:rPr>
+        <w:t xml:space="preserve">Stripe, </w:t>
+      </w:r>
+      <w:proofErr w:type="spellStart"/>
+      <w:r>
+        <w:rPr>
+          <w:b/>
+          <w:bCs/>
+        </w:rPr>
+        <w:t>Vercel</w:t>
+      </w:r>
+      <w:proofErr w:type="spellEnd"/>
+      <w:r>
+        <w:rPr>
+          <w:b/>
+          <w:bCs/>
+        </w:rPr>
+        <w:t xml:space="preserve">, GitHub, Clerk, OpenAI and </w:t>
+      </w:r>
+      <w:proofErr w:type="spellStart"/>
+      <w:r>
+        <w:rPr>
+          <w:b/>
+          <w:bCs/>
+        </w:rPr>
+        <w:t>Upstash</w:t>
+      </w:r>
+      <w:proofErr w:type="spellEnd"/>
+      <w:r>
+        <w:t xml:space="preserve">. This is the most important item on the list. The most likely way a small app gets hacked is through the owner's accounts, not the code; someone with your Stripe or </w:t>
+      </w:r>
+      <w:proofErr w:type="spellStart"/>
+      <w:r>
+        <w:t>Vercel</w:t>
+      </w:r>
+      <w:proofErr w:type="spellEnd"/>
+      <w:r>
+        <w:t xml:space="preserve"> login could redirect payments or read every key.</w:t>
+      </w:r>
+    </w:p>
+    <w:p>
+      <w:pPr>
+        <w:numPr>
+          <w:ilvl w:val="0"/>
+          <w:numId w:val="9"/>
+        </w:numPr>
+      </w:pPr>
+      <w:r>
+        <w:rPr>
+          <w:b/>
+          <w:bCs/>
+        </w:rPr>
+        <w:t>Check GitHub for old keys.</w:t>
+      </w:r>
+      <w:r>
+        <w:t xml:space="preserve"> In your repo's </w:t>
+      </w:r>
+      <w:r>
+        <w:rPr>
+          <w:b/>
+          <w:bCs/>
+        </w:rPr>
+        <w:t>Settings → Code security</w:t>
+      </w:r>
+      <w:r>
+        <w:t xml:space="preserve">, turn on </w:t>
+      </w:r>
+      <w:r>
+        <w:rPr>
+          <w:b/>
+          <w:bCs/>
+        </w:rPr>
+        <w:t>Secret scanning</w:t>
+      </w:r>
+      <w:r>
+        <w:t xml:space="preserve"> and </w:t>
+      </w:r>
+      <w:r>
+        <w:rPr>
+          <w:b/>
+          <w:bCs/>
+        </w:rPr>
+        <w:t>Push protection</w:t>
+      </w:r>
+      <w:r>
+        <w:t>. If any key was ever committed, rotate it (create a new one and delete the old).</w:t>
+      </w:r>
+    </w:p>
+    <w:p>
+      <w:pPr>
+        <w:numPr>
+          <w:ilvl w:val="0"/>
+          <w:numId w:val="9"/>
+        </w:numPr>
+      </w:pPr>
+      <w:r>
+        <w:rPr>
+          <w:b/>
+          <w:bCs/>
+        </w:rPr>
+        <w:t>Use a restricted Stripe key when you go live.</w:t>
+      </w:r>
+      <w:r>
+        <w:t xml:space="preserve"> In Stripe, create a </w:t>
+      </w:r>
+      <w:r>
+        <w:rPr>
+          <w:b/>
+          <w:bCs/>
+        </w:rPr>
+        <w:t>restricted key</w:t>
+      </w:r>
+      <w:r>
+        <w:t xml:space="preserve"> with only the permissions the app needs (Checkout Sessions, Customers, Billing Portal) instead of your full secret key.</w:t>
+      </w:r>
+    </w:p>
+    <w:p>
+      <w:pPr>
+        <w:numPr>
+          <w:ilvl w:val="0"/>
+          <w:numId w:val="9"/>
+        </w:numPr>
+      </w:pPr>
+      <w:r>
+        <w:rPr>
+          <w:b/>
+          <w:bCs/>
+        </w:rPr>
+        <w:t>Turn on sign-up protection in Clerk:</w:t>
+      </w:r>
+      <w:r>
+        <w:t xml:space="preserve"> email verification and bot protection, plus MFA for users if you move to Clerk Pro.</w:t>
+      </w:r>
+    </w:p>
+    <w:p>
+      <w:pPr>
+        <w:numPr>
+          <w:ilvl w:val="0"/>
+          <w:numId w:val="9"/>
+        </w:numPr>
+      </w:pPr>
+      <w:r>
+        <w:rPr>
+          <w:b/>
+          <w:bCs/>
+        </w:rPr>
+        <w:lastRenderedPageBreak/>
+        <w:t>Add a "Clear my saved plans" button.</w:t>
+      </w:r>
+      <w:r>
+        <w:t xml:space="preserve"> Saved plans live unencrypted in the browser, which is fine on a personal device but risky on shared or public computers. The app should say so and make it easy to delete them.</w:t>
+      </w:r>
+    </w:p>
+    <w:p>
+      <w:pPr>
+        <w:numPr>
+          <w:ilvl w:val="0"/>
+          <w:numId w:val="9"/>
+        </w:numPr>
+      </w:pPr>
+      <w:r>
+        <w:rPr>
+          <w:b/>
+          <w:bCs/>
+        </w:rPr>
+        <w:t>Keep libraries updated:</w:t>
+      </w:r>
+      <w:r>
+        <w:t xml:space="preserve"> run </w:t>
+      </w:r>
+      <w:proofErr w:type="spellStart"/>
+      <w:r>
+        <w:t>npm</w:t>
+      </w:r>
+      <w:proofErr w:type="spellEnd"/>
+      <w:r>
+        <w:t xml:space="preserve"> audit </w:t>
+      </w:r>
+      <w:proofErr w:type="gramStart"/>
+      <w:r>
+        <w:t>monthly, and</w:t>
+      </w:r>
+      <w:proofErr w:type="gramEnd"/>
+      <w:r>
+        <w:t xml:space="preserve"> turn on </w:t>
+      </w:r>
+      <w:proofErr w:type="spellStart"/>
+      <w:r>
+        <w:rPr>
+          <w:b/>
+          <w:bCs/>
+        </w:rPr>
+        <w:t>Dependabot</w:t>
+      </w:r>
+      <w:proofErr w:type="spellEnd"/>
+      <w:r>
+        <w:t xml:space="preserve"> in GitHub so security updates arrive automatically.</w:t>
+      </w:r>
+    </w:p>
+    <w:p>
+      <w:pPr>
+        <w:numPr>
+          <w:ilvl w:val="0"/>
+          <w:numId w:val="9"/>
+        </w:numPr>
+      </w:pPr>
+      <w:r>
+        <w:rPr>
+          <w:b/>
+          <w:bCs/>
+        </w:rPr>
+        <w:t>Legal duties:</w:t>
+      </w:r>
+      <w:r>
+        <w:t xml:space="preserve"> under New Zealand's Privacy Act 2020, you must notify the Privacy Commissioner and affected people about a serious privacy breach. Your privacy policy (on the About page) should say what you collect, where it's kept, and how to contact you.</w:t>
+      </w:r>
+    </w:p>
+    <w:p>
+      <w:r>
+        <w:t>Item 5 is the only one that needs a code change. Shall I add the "Clear my saved plans" button and a shared-computer warning to the projector?</w:t>
       </w:r>
     </w:p>
     <w:p/>
@@ -8465,6 +9688,119 @@
     </w:lvl>
   </w:abstractNum>
   <w:abstractNum w:abstractNumId="2" w15:restartNumberingAfterBreak="0">
+    <w:nsid w:val="48E70492"/>
+    <w:multiLevelType w:val="multilevel"/>
+    <w:tmpl w:val="FC9A3FB2"/>
+    <w:lvl w:ilvl="0">
+      <w:start w:val="1"/>
+      <w:numFmt w:val="decimal"/>
+      <w:lvlText w:val="%1."/>
+      <w:lvlJc w:val="left"/>
+      <w:pPr>
+        <w:tabs>
+          <w:tab w:val="num" w:pos="720"/>
+        </w:tabs>
+        <w:ind w:left="720" w:hanging="360"/>
+      </w:pPr>
+    </w:lvl>
+    <w:lvl w:ilvl="1" w:tentative="1">
+      <w:start w:val="1"/>
+      <w:numFmt w:val="decimal"/>
+      <w:lvlText w:val="%2."/>
+      <w:lvlJc w:val="left"/>
+      <w:pPr>
+        <w:tabs>
+          <w:tab w:val="num" w:pos="1440"/>
+        </w:tabs>
+        <w:ind w:left="1440" w:hanging="360"/>
+      </w:pPr>
+    </w:lvl>
+    <w:lvl w:ilvl="2" w:tentative="1">
+      <w:start w:val="1"/>
+      <w:numFmt w:val="decimal"/>
+      <w:lvlText w:val="%3."/>
+      <w:lvlJc w:val="left"/>
+      <w:pPr>
+        <w:tabs>
+          <w:tab w:val="num" w:pos="2160"/>
+        </w:tabs>
+        <w:ind w:left="2160" w:hanging="360"/>
+      </w:pPr>
+    </w:lvl>
+    <w:lvl w:ilvl="3" w:tentative="1">
+      <w:start w:val="1"/>
+      <w:numFmt w:val="decimal"/>
+      <w:lvlText w:val="%4."/>
+      <w:lvlJc w:val="left"/>
+      <w:pPr>
+        <w:tabs>
+          <w:tab w:val="num" w:pos="2880"/>
+        </w:tabs>
+        <w:ind w:left="2880" w:hanging="360"/>
+      </w:pPr>
+    </w:lvl>
+    <w:lvl w:ilvl="4" w:tentative="1">
+      <w:start w:val="1"/>
+      <w:numFmt w:val="decimal"/>
+      <w:lvlText w:val="%5."/>
+      <w:lvlJc w:val="left"/>
+      <w:pPr>
+        <w:tabs>
+          <w:tab w:val="num" w:pos="3600"/>
+        </w:tabs>
+        <w:ind w:left="3600" w:hanging="360"/>
+      </w:pPr>
+    </w:lvl>
+    <w:lvl w:ilvl="5" w:tentative="1">
+      <w:start w:val="1"/>
+      <w:numFmt w:val="decimal"/>
+      <w:lvlText w:val="%6."/>
+      <w:lvlJc w:val="left"/>
+      <w:pPr>
+        <w:tabs>
+          <w:tab w:val="num" w:pos="4320"/>
+        </w:tabs>
+        <w:ind w:left="4320" w:hanging="360"/>
+      </w:pPr>
+    </w:lvl>
+    <w:lvl w:ilvl="6" w:tentative="1">
+      <w:start w:val="1"/>
+      <w:numFmt w:val="decimal"/>
+      <w:lvlText w:val="%7."/>
+      <w:lvlJc w:val="left"/>
+      <w:pPr>
+        <w:tabs>
+          <w:tab w:val="num" w:pos="5040"/>
+        </w:tabs>
+        <w:ind w:left="5040" w:hanging="360"/>
+      </w:pPr>
+    </w:lvl>
+    <w:lvl w:ilvl="7" w:tentative="1">
+      <w:start w:val="1"/>
+      <w:numFmt w:val="decimal"/>
+      <w:lvlText w:val="%8."/>
+      <w:lvlJc w:val="left"/>
+      <w:pPr>
+        <w:tabs>
+          <w:tab w:val="num" w:pos="5760"/>
+        </w:tabs>
+        <w:ind w:left="5760" w:hanging="360"/>
+      </w:pPr>
+    </w:lvl>
+    <w:lvl w:ilvl="8" w:tentative="1">
+      <w:start w:val="1"/>
+      <w:numFmt w:val="decimal"/>
+      <w:lvlText w:val="%9."/>
+      <w:lvlJc w:val="left"/>
+      <w:pPr>
+        <w:tabs>
+          <w:tab w:val="num" w:pos="6480"/>
+        </w:tabs>
+        <w:ind w:left="6480" w:hanging="360"/>
+      </w:pPr>
+    </w:lvl>
+  </w:abstractNum>
+  <w:abstractNum w:abstractNumId="3" w15:restartNumberingAfterBreak="0">
     <w:nsid w:val="62F815D5"/>
     <w:multiLevelType w:val="multilevel"/>
     <w:tmpl w:val="631493D2"/>
@@ -8613,7 +9949,7 @@
       </w:rPr>
     </w:lvl>
   </w:abstractNum>
-  <w:abstractNum w:abstractNumId="3" w15:restartNumberingAfterBreak="0">
+  <w:abstractNum w:abstractNumId="4" w15:restartNumberingAfterBreak="0">
     <w:nsid w:val="63AE4D5C"/>
     <w:multiLevelType w:val="multilevel"/>
     <w:tmpl w:val="EF9E4358"/>
@@ -8762,7 +10098,7 @@
       </w:rPr>
     </w:lvl>
   </w:abstractNum>
-  <w:abstractNum w:abstractNumId="4" w15:restartNumberingAfterBreak="0">
+  <w:abstractNum w:abstractNumId="5" w15:restartNumberingAfterBreak="0">
     <w:nsid w:val="69D27735"/>
     <w:multiLevelType w:val="multilevel"/>
     <w:tmpl w:val="F794851E"/>
@@ -8911,7 +10247,7 @@
       </w:rPr>
     </w:lvl>
   </w:abstractNum>
-  <w:abstractNum w:abstractNumId="5" w15:restartNumberingAfterBreak="0">
+  <w:abstractNum w:abstractNumId="6" w15:restartNumberingAfterBreak="0">
     <w:nsid w:val="6D011207"/>
     <w:multiLevelType w:val="multilevel"/>
     <w:tmpl w:val="9FD8CAE4"/>
@@ -9060,7 +10396,7 @@
       </w:rPr>
     </w:lvl>
   </w:abstractNum>
-  <w:abstractNum w:abstractNumId="6" w15:restartNumberingAfterBreak="0">
+  <w:abstractNum w:abstractNumId="7" w15:restartNumberingAfterBreak="0">
     <w:nsid w:val="6FCA5B43"/>
     <w:multiLevelType w:val="multilevel"/>
     <w:tmpl w:val="A468C194"/>
@@ -9173,7 +10509,7 @@
       </w:pPr>
     </w:lvl>
   </w:abstractNum>
-  <w:abstractNum w:abstractNumId="7" w15:restartNumberingAfterBreak="0">
+  <w:abstractNum w:abstractNumId="8" w15:restartNumberingAfterBreak="0">
     <w:nsid w:val="7E054ED3"/>
     <w:multiLevelType w:val="multilevel"/>
     <w:tmpl w:val="72BACE9E"/>
@@ -9287,13 +10623,13 @@
     </w:lvl>
   </w:abstractNum>
   <w:num w:numId="1" w16cid:durableId="1961909932">
-    <w:abstractNumId w:val="6"/>
+    <w:abstractNumId w:val="7"/>
   </w:num>
   <w:num w:numId="2" w16cid:durableId="184446635">
-    <w:abstractNumId w:val="3"/>
+    <w:abstractNumId w:val="4"/>
   </w:num>
   <w:num w:numId="3" w16cid:durableId="221987474">
-    <w:abstractNumId w:val="5"/>
+    <w:abstractNumId w:val="6"/>
   </w:num>
   <w:num w:numId="4" w16cid:durableId="613052076">
     <w:abstractNumId w:val="0"/>
@@ -9302,13 +10638,16 @@
     <w:abstractNumId w:val="1"/>
   </w:num>
   <w:num w:numId="6" w16cid:durableId="603998884">
-    <w:abstractNumId w:val="2"/>
+    <w:abstractNumId w:val="3"/>
   </w:num>
   <w:num w:numId="7" w16cid:durableId="436218807">
-    <w:abstractNumId w:val="7"/>
+    <w:abstractNumId w:val="8"/>
   </w:num>
   <w:num w:numId="8" w16cid:durableId="510218858">
-    <w:abstractNumId w:val="4"/>
+    <w:abstractNumId w:val="5"/>
+  </w:num>
+  <w:num w:numId="9" w16cid:durableId="1861817274">
+    <w:abstractNumId w:val="2"/>
   </w:num>
 </w:numbering>
 </file>

</xml_diff>